<commit_message>
Add some changes to report and project
</commit_message>
<xml_diff>
--- a/lab6-java.docx
+++ b/lab6-java.docx
@@ -115,8 +115,6 @@
           <w:szCs w:val="28"/>
         </w:rPr>
       </w:pPr>
-      <w:bookmarkStart w:id="0" w:name="_GoBack"/>
-      <w:bookmarkEnd w:id="0"/>
     </w:p>
     <w:p>
       <w:pPr>
@@ -433,6 +431,8 @@
     </w:p>
     <w:p>
       <w:pPr>
+        <w:ind w:firstLine="709"/>
+        <w:jc w:val="both"/>
         <w:rPr>
           <w:rFonts w:ascii="Times New Roman" w:hAnsi="Times New Roman" w:cs="Times New Roman"/>
           <w:sz w:val="28"/>
@@ -487,6 +487,8 @@
     </w:p>
     <w:p>
       <w:pPr>
+        <w:ind w:firstLine="709"/>
+        <w:jc w:val="both"/>
         <w:rPr>
           <w:rFonts w:ascii="Times New Roman" w:hAnsi="Times New Roman" w:cs="Times New Roman"/>
           <w:b/>
@@ -508,6 +510,8 @@
     </w:p>
     <w:p>
       <w:pPr>
+        <w:ind w:firstLine="709"/>
+        <w:jc w:val="both"/>
         <w:rPr>
           <w:rFonts w:ascii="Times New Roman" w:hAnsi="Times New Roman" w:cs="Times New Roman"/>
           <w:sz w:val="28"/>
@@ -550,6 +554,7 @@
     </w:p>
     <w:p>
       <w:pPr>
+        <w:ind w:firstLine="709"/>
         <w:rPr>
           <w:rFonts w:ascii="Times New Roman" w:hAnsi="Times New Roman" w:cs="Times New Roman"/>
           <w:sz w:val="28"/>
@@ -577,6 +582,7 @@
       <w:r>
         <w:rPr>
           <w:rFonts w:ascii="Times New Roman" w:hAnsi="Times New Roman" w:cs="Times New Roman"/>
+          <w:noProof/>
           <w:sz w:val="28"/>
           <w:szCs w:val="28"/>
         </w:rPr>
@@ -637,42 +643,41 @@
     </w:p>
     <w:p>
       <w:pPr>
-        <w:rPr>
-          <w:rFonts w:ascii="Times New Roman" w:hAnsi="Times New Roman" w:cs="Times New Roman"/>
-          <w:sz w:val="28"/>
-          <w:szCs w:val="28"/>
-        </w:rPr>
-      </w:pPr>
-      <w:r>
-        <w:rPr>
-          <w:rFonts w:ascii="Times New Roman" w:hAnsi="Times New Roman" w:cs="Times New Roman"/>
-          <w:sz w:val="28"/>
-          <w:szCs w:val="28"/>
-        </w:rPr>
-        <w:t>Запустили клиента</w:t>
-      </w:r>
-    </w:p>
-    <w:p>
-      <w:pPr>
-        <w:rPr>
-          <w:rFonts w:ascii="Times New Roman" w:hAnsi="Times New Roman" w:cs="Times New Roman"/>
-          <w:sz w:val="28"/>
-          <w:szCs w:val="28"/>
-          <w:lang w:val="en-US"/>
-        </w:rPr>
-      </w:pPr>
-      <w:r>
-        <w:rPr>
-          <w:rFonts w:ascii="Times New Roman" w:hAnsi="Times New Roman" w:cs="Times New Roman"/>
-          <w:sz w:val="28"/>
-          <w:szCs w:val="28"/>
-          <w:lang w:val="en-US"/>
+        <w:ind w:firstLine="709"/>
+        <w:rPr>
+          <w:rFonts w:ascii="Times New Roman" w:hAnsi="Times New Roman" w:cs="Times New Roman"/>
+          <w:sz w:val="28"/>
+          <w:szCs w:val="28"/>
+        </w:rPr>
+      </w:pPr>
+      <w:r>
+        <w:rPr>
+          <w:rFonts w:ascii="Times New Roman" w:hAnsi="Times New Roman" w:cs="Times New Roman"/>
+          <w:sz w:val="28"/>
+          <w:szCs w:val="28"/>
+        </w:rPr>
+        <w:t>Создали задачу, ждем подключения от 6 клиентов.</w:t>
+      </w:r>
+    </w:p>
+    <w:p>
+      <w:pPr>
+        <w:rPr>
+          <w:rFonts w:ascii="Times New Roman" w:hAnsi="Times New Roman" w:cs="Times New Roman"/>
+          <w:sz w:val="28"/>
+          <w:szCs w:val="28"/>
+        </w:rPr>
+      </w:pPr>
+      <w:r>
+        <w:rPr>
+          <w:rFonts w:ascii="Times New Roman" w:hAnsi="Times New Roman" w:cs="Times New Roman"/>
+          <w:sz w:val="28"/>
+          <w:szCs w:val="28"/>
         </w:rPr>
         <w:drawing>
-          <wp:inline distT="0" distB="0" distL="0" distR="0" wp14:anchorId="0A06A7D6" wp14:editId="6E1E4DA0">
-            <wp:extent cx="4877481" cy="733527"/>
-            <wp:effectExtent l="0" t="0" r="0" b="9525"/>
-            <wp:docPr id="2" name="Рисунок 2"/>
+          <wp:inline distT="0" distB="0" distL="0" distR="0" wp14:anchorId="1A243D5D" wp14:editId="29077741">
+            <wp:extent cx="3982006" cy="466790"/>
+            <wp:effectExtent l="19050" t="19050" r="19050" b="28575"/>
+            <wp:docPr id="4" name="Рисунок 4"/>
             <wp:cNvGraphicFramePr>
               <a:graphicFrameLocks xmlns:a="http://schemas.openxmlformats.org/drawingml/2006/main" noChangeAspect="1"/>
             </wp:cNvGraphicFramePr>
@@ -692,11 +697,16 @@
                   <pic:spPr>
                     <a:xfrm>
                       <a:off x="0" y="0"/>
-                      <a:ext cx="4877481" cy="733527"/>
+                      <a:ext cx="3982006" cy="466790"/>
                     </a:xfrm>
                     <a:prstGeom prst="rect">
                       <a:avLst/>
                     </a:prstGeom>
+                    <a:ln>
+                      <a:solidFill>
+                        <a:schemeClr val="tx1"/>
+                      </a:solidFill>
+                    </a:ln>
                   </pic:spPr>
                 </pic:pic>
               </a:graphicData>
@@ -707,42 +717,49 @@
     </w:p>
     <w:p>
       <w:pPr>
-        <w:rPr>
-          <w:rFonts w:ascii="Times New Roman" w:hAnsi="Times New Roman" w:cs="Times New Roman"/>
-          <w:sz w:val="28"/>
-          <w:szCs w:val="28"/>
-        </w:rPr>
-      </w:pPr>
-      <w:r>
-        <w:rPr>
-          <w:rFonts w:ascii="Times New Roman" w:hAnsi="Times New Roman" w:cs="Times New Roman"/>
-          <w:sz w:val="28"/>
-          <w:szCs w:val="28"/>
-        </w:rPr>
-        <w:t>Отправили задачу с сервера клиенту</w:t>
-      </w:r>
-    </w:p>
-    <w:p>
-      <w:pPr>
-        <w:rPr>
-          <w:rFonts w:ascii="Times New Roman" w:hAnsi="Times New Roman" w:cs="Times New Roman"/>
-          <w:sz w:val="28"/>
-          <w:szCs w:val="28"/>
-          <w:lang w:val="en-US"/>
-        </w:rPr>
-      </w:pPr>
-      <w:r>
-        <w:rPr>
-          <w:rFonts w:ascii="Times New Roman" w:hAnsi="Times New Roman" w:cs="Times New Roman"/>
-          <w:sz w:val="28"/>
-          <w:szCs w:val="28"/>
-          <w:lang w:val="en-US"/>
+        <w:jc w:val="center"/>
+        <w:rPr>
+          <w:rFonts w:ascii="Times New Roman" w:hAnsi="Times New Roman" w:cs="Times New Roman"/>
+          <w:sz w:val="24"/>
+          <w:szCs w:val="24"/>
+        </w:rPr>
+      </w:pPr>
+      <w:r>
+        <w:rPr>
+          <w:rFonts w:ascii="Times New Roman" w:hAnsi="Times New Roman" w:cs="Times New Roman"/>
+          <w:sz w:val="24"/>
+          <w:szCs w:val="24"/>
+        </w:rPr>
+        <w:t xml:space="preserve">Рисунок 1 </w:t>
+      </w:r>
+      <w:r>
+        <w:rPr>
+          <w:rFonts w:ascii="Times New Roman" w:hAnsi="Times New Roman" w:cs="Times New Roman"/>
+          <w:sz w:val="24"/>
+          <w:szCs w:val="24"/>
+        </w:rPr>
+        <w:t>– отображение результата в форме</w:t>
+      </w:r>
+    </w:p>
+    <w:p>
+      <w:pPr>
+        <w:rPr>
+          <w:rFonts w:ascii="Times New Roman" w:hAnsi="Times New Roman" w:cs="Times New Roman"/>
+          <w:sz w:val="28"/>
+          <w:szCs w:val="28"/>
+        </w:rPr>
+      </w:pPr>
+      <w:r>
+        <w:rPr>
+          <w:rFonts w:ascii="Times New Roman" w:hAnsi="Times New Roman" w:cs="Times New Roman"/>
+          <w:sz w:val="28"/>
+          <w:szCs w:val="28"/>
         </w:rPr>
         <w:drawing>
-          <wp:inline distT="0" distB="0" distL="0" distR="0" wp14:anchorId="2AF2D3D3" wp14:editId="7ADFEBFC">
-            <wp:extent cx="2114845" cy="209579"/>
-            <wp:effectExtent l="0" t="0" r="0" b="0"/>
-            <wp:docPr id="3" name="Рисунок 3"/>
+          <wp:inline distT="0" distB="0" distL="0" distR="0" wp14:anchorId="2C70FE15" wp14:editId="1EC723A5">
+            <wp:extent cx="5182323" cy="476316"/>
+            <wp:effectExtent l="19050" t="19050" r="18415" b="19050"/>
+            <wp:docPr id="9" name="Рисунок 9"/>
             <wp:cNvGraphicFramePr>
               <a:graphicFrameLocks xmlns:a="http://schemas.openxmlformats.org/drawingml/2006/main" noChangeAspect="1"/>
             </wp:cNvGraphicFramePr>
@@ -762,11 +779,16 @@
                   <pic:spPr>
                     <a:xfrm>
                       <a:off x="0" y="0"/>
-                      <a:ext cx="2114845" cy="209579"/>
+                      <a:ext cx="5182323" cy="476316"/>
                     </a:xfrm>
                     <a:prstGeom prst="rect">
                       <a:avLst/>
                     </a:prstGeom>
+                    <a:ln>
+                      <a:solidFill>
+                        <a:schemeClr val="tx1"/>
+                      </a:solidFill>
+                    </a:ln>
                   </pic:spPr>
                 </pic:pic>
               </a:graphicData>
@@ -777,41 +799,83 @@
     </w:p>
     <w:p>
       <w:pPr>
-        <w:rPr>
-          <w:rFonts w:ascii="Times New Roman" w:hAnsi="Times New Roman" w:cs="Times New Roman"/>
-          <w:sz w:val="28"/>
-          <w:szCs w:val="28"/>
-        </w:rPr>
-      </w:pPr>
-      <w:r>
-        <w:rPr>
-          <w:rFonts w:ascii="Times New Roman" w:hAnsi="Times New Roman" w:cs="Times New Roman"/>
-          <w:sz w:val="28"/>
-          <w:szCs w:val="28"/>
-        </w:rPr>
-        <w:t>Получили задачу и отправили решение на сервер</w:t>
-      </w:r>
-    </w:p>
-    <w:p>
-      <w:pPr>
-        <w:rPr>
-          <w:rFonts w:ascii="Times New Roman" w:hAnsi="Times New Roman" w:cs="Times New Roman"/>
-          <w:sz w:val="28"/>
-          <w:szCs w:val="28"/>
-        </w:rPr>
-      </w:pPr>
-      <w:r>
-        <w:rPr>
-          <w:rFonts w:ascii="Times New Roman" w:hAnsi="Times New Roman" w:cs="Times New Roman"/>
-          <w:sz w:val="28"/>
-          <w:szCs w:val="28"/>
-          <w:lang w:val="en-US"/>
+        <w:jc w:val="center"/>
+        <w:rPr>
+          <w:rFonts w:ascii="Times New Roman" w:hAnsi="Times New Roman" w:cs="Times New Roman"/>
+          <w:sz w:val="24"/>
+          <w:szCs w:val="24"/>
+        </w:rPr>
+      </w:pPr>
+      <w:r>
+        <w:rPr>
+          <w:rFonts w:ascii="Times New Roman" w:hAnsi="Times New Roman" w:cs="Times New Roman"/>
+          <w:sz w:val="24"/>
+          <w:szCs w:val="24"/>
+        </w:rPr>
+        <w:t xml:space="preserve">Рисунок </w:t>
+      </w:r>
+      <w:r>
+        <w:rPr>
+          <w:rFonts w:ascii="Times New Roman" w:hAnsi="Times New Roman" w:cs="Times New Roman"/>
+          <w:sz w:val="24"/>
+          <w:szCs w:val="24"/>
+        </w:rPr>
+        <w:t>2</w:t>
+      </w:r>
+      <w:r>
+        <w:rPr>
+          <w:rFonts w:ascii="Times New Roman" w:hAnsi="Times New Roman" w:cs="Times New Roman"/>
+          <w:sz w:val="24"/>
+          <w:szCs w:val="24"/>
+        </w:rPr>
+        <w:t xml:space="preserve"> </w:t>
+      </w:r>
+      <w:r>
+        <w:rPr>
+          <w:rFonts w:ascii="Times New Roman" w:hAnsi="Times New Roman" w:cs="Times New Roman"/>
+          <w:sz w:val="24"/>
+          <w:szCs w:val="24"/>
+        </w:rPr>
+        <w:t>– отправляем задачу в очередь</w:t>
+      </w:r>
+    </w:p>
+    <w:p>
+      <w:pPr>
+        <w:ind w:firstLine="709"/>
+        <w:rPr>
+          <w:rFonts w:ascii="Times New Roman" w:hAnsi="Times New Roman" w:cs="Times New Roman"/>
+          <w:sz w:val="28"/>
+          <w:szCs w:val="28"/>
+        </w:rPr>
+      </w:pPr>
+      <w:r>
+        <w:rPr>
+          <w:rFonts w:ascii="Times New Roman" w:hAnsi="Times New Roman" w:cs="Times New Roman"/>
+          <w:sz w:val="28"/>
+          <w:szCs w:val="28"/>
+        </w:rPr>
+        <w:t>Подключили 6 клиентов</w:t>
+      </w:r>
+    </w:p>
+    <w:p>
+      <w:pPr>
+        <w:rPr>
+          <w:rFonts w:ascii="Times New Roman" w:hAnsi="Times New Roman" w:cs="Times New Roman"/>
+          <w:sz w:val="28"/>
+          <w:szCs w:val="28"/>
+        </w:rPr>
+      </w:pPr>
+      <w:r>
+        <w:rPr>
+          <w:rFonts w:ascii="Times New Roman" w:hAnsi="Times New Roman" w:cs="Times New Roman"/>
+          <w:sz w:val="28"/>
+          <w:szCs w:val="28"/>
         </w:rPr>
         <w:drawing>
-          <wp:inline distT="0" distB="0" distL="0" distR="0" wp14:anchorId="06B7BB27" wp14:editId="21172627">
-            <wp:extent cx="4667901" cy="876422"/>
-            <wp:effectExtent l="0" t="0" r="0" b="0"/>
-            <wp:docPr id="5" name="Рисунок 5"/>
+          <wp:inline distT="0" distB="0" distL="0" distR="0" wp14:anchorId="02FE15D3" wp14:editId="27379799">
+            <wp:extent cx="5258534" cy="2724530"/>
+            <wp:effectExtent l="19050" t="19050" r="18415" b="19050"/>
+            <wp:docPr id="8" name="Рисунок 8"/>
             <wp:cNvGraphicFramePr>
               <a:graphicFrameLocks xmlns:a="http://schemas.openxmlformats.org/drawingml/2006/main" noChangeAspect="1"/>
             </wp:cNvGraphicFramePr>
@@ -831,11 +895,16 @@
                   <pic:spPr>
                     <a:xfrm>
                       <a:off x="0" y="0"/>
-                      <a:ext cx="4667901" cy="876422"/>
+                      <a:ext cx="5258534" cy="2724530"/>
                     </a:xfrm>
                     <a:prstGeom prst="rect">
                       <a:avLst/>
                     </a:prstGeom>
+                    <a:ln>
+                      <a:solidFill>
+                        <a:schemeClr val="tx1"/>
+                      </a:solidFill>
+                    </a:ln>
                   </pic:spPr>
                 </pic:pic>
               </a:graphicData>
@@ -843,45 +912,88 @@
           </wp:inline>
         </w:drawing>
       </w:r>
-      <w:r>
-        <w:rPr>
-          <w:rFonts w:ascii="Times New Roman" w:hAnsi="Times New Roman" w:cs="Times New Roman"/>
-          <w:sz w:val="28"/>
-          <w:szCs w:val="28"/>
-          <w:lang w:val="en-US"/>
-        </w:rPr>
-        <w:br/>
-      </w:r>
-      <w:r>
-        <w:rPr>
-          <w:rFonts w:ascii="Times New Roman" w:hAnsi="Times New Roman" w:cs="Times New Roman"/>
-          <w:sz w:val="28"/>
-          <w:szCs w:val="28"/>
-        </w:rPr>
-        <w:t>Получили решение на сервере</w:t>
-      </w:r>
-    </w:p>
-    <w:p>
-      <w:pPr>
-        <w:rPr>
-          <w:rFonts w:ascii="Times New Roman" w:hAnsi="Times New Roman" w:cs="Times New Roman"/>
-          <w:sz w:val="28"/>
-          <w:szCs w:val="28"/>
-          <w:lang w:val="en-US"/>
-        </w:rPr>
-      </w:pPr>
-      <w:r>
-        <w:rPr>
-          <w:rFonts w:ascii="Times New Roman" w:hAnsi="Times New Roman" w:cs="Times New Roman"/>
-          <w:sz w:val="28"/>
-          <w:szCs w:val="28"/>
-          <w:lang w:val="en-US"/>
+    </w:p>
+    <w:p>
+      <w:pPr>
+        <w:jc w:val="center"/>
+        <w:rPr>
+          <w:rFonts w:ascii="Times New Roman" w:hAnsi="Times New Roman" w:cs="Times New Roman"/>
+          <w:sz w:val="24"/>
+          <w:szCs w:val="24"/>
+        </w:rPr>
+      </w:pPr>
+      <w:r>
+        <w:rPr>
+          <w:rFonts w:ascii="Times New Roman" w:hAnsi="Times New Roman" w:cs="Times New Roman"/>
+          <w:sz w:val="24"/>
+          <w:szCs w:val="24"/>
+        </w:rPr>
+        <w:t xml:space="preserve">Рисунок </w:t>
+      </w:r>
+      <w:r>
+        <w:rPr>
+          <w:rFonts w:ascii="Times New Roman" w:hAnsi="Times New Roman" w:cs="Times New Roman"/>
+          <w:sz w:val="24"/>
+          <w:szCs w:val="24"/>
+        </w:rPr>
+        <w:t>3</w:t>
+      </w:r>
+      <w:r>
+        <w:rPr>
+          <w:rFonts w:ascii="Times New Roman" w:hAnsi="Times New Roman" w:cs="Times New Roman"/>
+          <w:sz w:val="24"/>
+          <w:szCs w:val="24"/>
+        </w:rPr>
+        <w:t xml:space="preserve"> </w:t>
+      </w:r>
+      <w:r>
+        <w:rPr>
+          <w:rFonts w:ascii="Times New Roman" w:hAnsi="Times New Roman" w:cs="Times New Roman"/>
+          <w:sz w:val="24"/>
+          <w:szCs w:val="24"/>
+        </w:rPr>
+        <w:t>– подключение 6 клиентов</w:t>
+      </w:r>
+    </w:p>
+    <w:p>
+      <w:pPr>
+        <w:ind w:firstLine="709"/>
+        <w:rPr>
+          <w:rFonts w:ascii="Times New Roman" w:hAnsi="Times New Roman" w:cs="Times New Roman"/>
+          <w:sz w:val="28"/>
+          <w:szCs w:val="28"/>
+        </w:rPr>
+      </w:pPr>
+      <w:bookmarkStart w:id="0" w:name="_GoBack"/>
+      <w:r>
+        <w:rPr>
+          <w:rFonts w:ascii="Times New Roman" w:hAnsi="Times New Roman" w:cs="Times New Roman"/>
+          <w:sz w:val="28"/>
+          <w:szCs w:val="28"/>
+        </w:rPr>
+        <w:t>Распределяем задачу на 6 клиентов</w:t>
+      </w:r>
+    </w:p>
+    <w:bookmarkEnd w:id="0"/>
+    <w:p>
+      <w:pPr>
+        <w:rPr>
+          <w:rFonts w:ascii="Times New Roman" w:hAnsi="Times New Roman" w:cs="Times New Roman"/>
+          <w:sz w:val="28"/>
+          <w:szCs w:val="28"/>
+        </w:rPr>
+      </w:pPr>
+      <w:r>
+        <w:rPr>
+          <w:rFonts w:ascii="Times New Roman" w:hAnsi="Times New Roman" w:cs="Times New Roman"/>
+          <w:sz w:val="28"/>
+          <w:szCs w:val="28"/>
         </w:rPr>
         <w:drawing>
-          <wp:inline distT="0" distB="0" distL="0" distR="0" wp14:anchorId="47BE6BEF" wp14:editId="01AFDFB1">
-            <wp:extent cx="3505689" cy="257211"/>
-            <wp:effectExtent l="0" t="0" r="0" b="9525"/>
-            <wp:docPr id="6" name="Рисунок 6"/>
+          <wp:inline distT="0" distB="0" distL="0" distR="0" wp14:anchorId="264EDD24" wp14:editId="0115AAE1">
+            <wp:extent cx="5940425" cy="328930"/>
+            <wp:effectExtent l="19050" t="19050" r="22225" b="13970"/>
+            <wp:docPr id="10" name="Рисунок 10"/>
             <wp:cNvGraphicFramePr>
               <a:graphicFrameLocks xmlns:a="http://schemas.openxmlformats.org/drawingml/2006/main" noChangeAspect="1"/>
             </wp:cNvGraphicFramePr>
@@ -901,11 +1013,16 @@
                   <pic:spPr>
                     <a:xfrm>
                       <a:off x="0" y="0"/>
-                      <a:ext cx="3505689" cy="257211"/>
+                      <a:ext cx="5940425" cy="328930"/>
                     </a:xfrm>
                     <a:prstGeom prst="rect">
                       <a:avLst/>
                     </a:prstGeom>
+                    <a:ln>
+                      <a:solidFill>
+                        <a:schemeClr val="tx1"/>
+                      </a:solidFill>
+                    </a:ln>
                   </pic:spPr>
                 </pic:pic>
               </a:graphicData>
@@ -916,42 +1033,81 @@
     </w:p>
     <w:p>
       <w:pPr>
-        <w:rPr>
-          <w:rFonts w:ascii="Times New Roman" w:hAnsi="Times New Roman" w:cs="Times New Roman"/>
-          <w:sz w:val="28"/>
-          <w:szCs w:val="28"/>
-        </w:rPr>
-      </w:pPr>
-      <w:r>
-        <w:rPr>
-          <w:rFonts w:ascii="Times New Roman" w:hAnsi="Times New Roman" w:cs="Times New Roman"/>
-          <w:sz w:val="28"/>
-          <w:szCs w:val="28"/>
-        </w:rPr>
-        <w:t>При выключении сервера клиент завершает работу.</w:t>
-      </w:r>
-    </w:p>
-    <w:p>
-      <w:pPr>
-        <w:rPr>
-          <w:rFonts w:ascii="Times New Roman" w:hAnsi="Times New Roman" w:cs="Times New Roman"/>
-          <w:sz w:val="28"/>
-          <w:szCs w:val="28"/>
-          <w:lang w:val="en-US"/>
-        </w:rPr>
-      </w:pPr>
-      <w:r>
-        <w:rPr>
-          <w:rFonts w:ascii="Times New Roman" w:hAnsi="Times New Roman" w:cs="Times New Roman"/>
-          <w:sz w:val="28"/>
-          <w:szCs w:val="28"/>
-          <w:lang w:val="en-US"/>
+        <w:jc w:val="center"/>
+        <w:rPr>
+          <w:rFonts w:ascii="Times New Roman" w:hAnsi="Times New Roman" w:cs="Times New Roman"/>
+          <w:sz w:val="24"/>
+          <w:szCs w:val="24"/>
+        </w:rPr>
+      </w:pPr>
+      <w:r>
+        <w:rPr>
+          <w:rFonts w:ascii="Times New Roman" w:hAnsi="Times New Roman" w:cs="Times New Roman"/>
+          <w:sz w:val="24"/>
+          <w:szCs w:val="24"/>
+        </w:rPr>
+        <w:t xml:space="preserve">Рисунок </w:t>
+      </w:r>
+      <w:r>
+        <w:rPr>
+          <w:rFonts w:ascii="Times New Roman" w:hAnsi="Times New Roman" w:cs="Times New Roman"/>
+          <w:sz w:val="24"/>
+          <w:szCs w:val="24"/>
+        </w:rPr>
+        <w:t>4</w:t>
+      </w:r>
+      <w:r>
+        <w:rPr>
+          <w:rFonts w:ascii="Times New Roman" w:hAnsi="Times New Roman" w:cs="Times New Roman"/>
+          <w:sz w:val="24"/>
+          <w:szCs w:val="24"/>
+        </w:rPr>
+        <w:t xml:space="preserve"> </w:t>
+      </w:r>
+      <w:r>
+        <w:rPr>
+          <w:rFonts w:ascii="Times New Roman" w:hAnsi="Times New Roman" w:cs="Times New Roman"/>
+          <w:sz w:val="24"/>
+          <w:szCs w:val="24"/>
+        </w:rPr>
+        <w:t>–</w:t>
+      </w:r>
+      <w:r>
+        <w:rPr>
+          <w:rFonts w:ascii="Times New Roman" w:hAnsi="Times New Roman" w:cs="Times New Roman"/>
+          <w:sz w:val="24"/>
+          <w:szCs w:val="24"/>
+        </w:rPr>
+        <w:t xml:space="preserve"> </w:t>
+      </w:r>
+      <w:r>
+        <w:rPr>
+          <w:rFonts w:ascii="Times New Roman" w:hAnsi="Times New Roman" w:cs="Times New Roman"/>
+          <w:sz w:val="24"/>
+          <w:szCs w:val="24"/>
+        </w:rPr>
+        <w:t>распределяем задачу на 6 клиентов</w:t>
+      </w:r>
+    </w:p>
+    <w:p>
+      <w:pPr>
+        <w:rPr>
+          <w:rFonts w:ascii="Times New Roman" w:hAnsi="Times New Roman" w:cs="Times New Roman"/>
+          <w:sz w:val="28"/>
+          <w:szCs w:val="28"/>
+        </w:rPr>
+      </w:pPr>
+      <w:r>
+        <w:rPr>
+          <w:rFonts w:ascii="Times New Roman" w:hAnsi="Times New Roman" w:cs="Times New Roman"/>
+          <w:sz w:val="28"/>
+          <w:szCs w:val="28"/>
         </w:rPr>
         <w:drawing>
-          <wp:inline distT="0" distB="0" distL="0" distR="0" wp14:anchorId="1C950E00" wp14:editId="7499E374">
-            <wp:extent cx="4677428" cy="533474"/>
-            <wp:effectExtent l="0" t="0" r="8890" b="0"/>
-            <wp:docPr id="7" name="Рисунок 7"/>
+          <wp:inline distT="0" distB="0" distL="0" distR="0" wp14:anchorId="02591AA1" wp14:editId="75090688">
+            <wp:extent cx="4877481" cy="666843"/>
+            <wp:effectExtent l="19050" t="19050" r="18415" b="19050"/>
+            <wp:docPr id="11" name="Рисунок 11"/>
             <wp:cNvGraphicFramePr>
               <a:graphicFrameLocks xmlns:a="http://schemas.openxmlformats.org/drawingml/2006/main" noChangeAspect="1"/>
             </wp:cNvGraphicFramePr>
@@ -971,7 +1127,793 @@
                   <pic:spPr>
                     <a:xfrm>
                       <a:off x="0" y="0"/>
-                      <a:ext cx="4677428" cy="533474"/>
+                      <a:ext cx="4877481" cy="666843"/>
+                    </a:xfrm>
+                    <a:prstGeom prst="rect">
+                      <a:avLst/>
+                    </a:prstGeom>
+                    <a:ln>
+                      <a:solidFill>
+                        <a:schemeClr val="tx1"/>
+                      </a:solidFill>
+                    </a:ln>
+                  </pic:spPr>
+                </pic:pic>
+              </a:graphicData>
+            </a:graphic>
+          </wp:inline>
+        </w:drawing>
+      </w:r>
+    </w:p>
+    <w:p>
+      <w:pPr>
+        <w:jc w:val="center"/>
+        <w:rPr>
+          <w:rFonts w:ascii="Times New Roman" w:hAnsi="Times New Roman" w:cs="Times New Roman"/>
+          <w:sz w:val="24"/>
+          <w:szCs w:val="24"/>
+        </w:rPr>
+      </w:pPr>
+      <w:r>
+        <w:rPr>
+          <w:rFonts w:ascii="Times New Roman" w:hAnsi="Times New Roman" w:cs="Times New Roman"/>
+          <w:sz w:val="24"/>
+          <w:szCs w:val="24"/>
+        </w:rPr>
+        <w:t xml:space="preserve">Рисунок </w:t>
+      </w:r>
+      <w:r>
+        <w:rPr>
+          <w:rFonts w:ascii="Times New Roman" w:hAnsi="Times New Roman" w:cs="Times New Roman"/>
+          <w:sz w:val="24"/>
+          <w:szCs w:val="24"/>
+        </w:rPr>
+        <w:t>5</w:t>
+      </w:r>
+      <w:r>
+        <w:rPr>
+          <w:rFonts w:ascii="Times New Roman" w:hAnsi="Times New Roman" w:cs="Times New Roman"/>
+          <w:sz w:val="24"/>
+          <w:szCs w:val="24"/>
+        </w:rPr>
+        <w:t xml:space="preserve"> </w:t>
+      </w:r>
+      <w:r>
+        <w:rPr>
+          <w:rFonts w:ascii="Times New Roman" w:hAnsi="Times New Roman" w:cs="Times New Roman"/>
+          <w:sz w:val="24"/>
+          <w:szCs w:val="24"/>
+        </w:rPr>
+        <w:t xml:space="preserve">– вычисление и отправка результата клиентом 0 </w:t>
+      </w:r>
+    </w:p>
+    <w:p>
+      <w:pPr>
+        <w:rPr>
+          <w:rFonts w:ascii="Times New Roman" w:hAnsi="Times New Roman" w:cs="Times New Roman"/>
+          <w:sz w:val="28"/>
+          <w:szCs w:val="28"/>
+        </w:rPr>
+      </w:pPr>
+      <w:r>
+        <w:rPr>
+          <w:rFonts w:ascii="Times New Roman" w:hAnsi="Times New Roman" w:cs="Times New Roman"/>
+          <w:sz w:val="28"/>
+          <w:szCs w:val="28"/>
+        </w:rPr>
+        <w:drawing>
+          <wp:inline distT="0" distB="0" distL="0" distR="0" wp14:anchorId="2D9E447C" wp14:editId="051793A2">
+            <wp:extent cx="5601482" cy="609685"/>
+            <wp:effectExtent l="19050" t="19050" r="18415" b="19050"/>
+            <wp:docPr id="12" name="Рисунок 12"/>
+            <wp:cNvGraphicFramePr>
+              <a:graphicFrameLocks xmlns:a="http://schemas.openxmlformats.org/drawingml/2006/main" noChangeAspect="1"/>
+            </wp:cNvGraphicFramePr>
+            <a:graphic xmlns:a="http://schemas.openxmlformats.org/drawingml/2006/main">
+              <a:graphicData uri="http://schemas.openxmlformats.org/drawingml/2006/picture">
+                <pic:pic xmlns:pic="http://schemas.openxmlformats.org/drawingml/2006/picture">
+                  <pic:nvPicPr>
+                    <pic:cNvPr id="1" name=""/>
+                    <pic:cNvPicPr/>
+                  </pic:nvPicPr>
+                  <pic:blipFill>
+                    <a:blip r:embed="rId10"/>
+                    <a:stretch>
+                      <a:fillRect/>
+                    </a:stretch>
+                  </pic:blipFill>
+                  <pic:spPr>
+                    <a:xfrm>
+                      <a:off x="0" y="0"/>
+                      <a:ext cx="5601482" cy="609685"/>
+                    </a:xfrm>
+                    <a:prstGeom prst="rect">
+                      <a:avLst/>
+                    </a:prstGeom>
+                    <a:ln>
+                      <a:solidFill>
+                        <a:schemeClr val="tx1"/>
+                      </a:solidFill>
+                    </a:ln>
+                  </pic:spPr>
+                </pic:pic>
+              </a:graphicData>
+            </a:graphic>
+          </wp:inline>
+        </w:drawing>
+      </w:r>
+    </w:p>
+    <w:p>
+      <w:pPr>
+        <w:jc w:val="center"/>
+        <w:rPr>
+          <w:rFonts w:ascii="Times New Roman" w:hAnsi="Times New Roman" w:cs="Times New Roman"/>
+          <w:sz w:val="24"/>
+          <w:szCs w:val="24"/>
+        </w:rPr>
+      </w:pPr>
+      <w:r>
+        <w:rPr>
+          <w:rFonts w:ascii="Times New Roman" w:hAnsi="Times New Roman" w:cs="Times New Roman"/>
+          <w:sz w:val="24"/>
+          <w:szCs w:val="24"/>
+        </w:rPr>
+        <w:t xml:space="preserve">Рисунок </w:t>
+      </w:r>
+      <w:r>
+        <w:rPr>
+          <w:rFonts w:ascii="Times New Roman" w:hAnsi="Times New Roman" w:cs="Times New Roman"/>
+          <w:sz w:val="24"/>
+          <w:szCs w:val="24"/>
+        </w:rPr>
+        <w:t>6</w:t>
+      </w:r>
+      <w:r>
+        <w:rPr>
+          <w:rFonts w:ascii="Times New Roman" w:hAnsi="Times New Roman" w:cs="Times New Roman"/>
+          <w:sz w:val="24"/>
+          <w:szCs w:val="24"/>
+        </w:rPr>
+        <w:t xml:space="preserve"> -</w:t>
+      </w:r>
+      <w:r>
+        <w:rPr>
+          <w:rFonts w:ascii="Times New Roman" w:hAnsi="Times New Roman" w:cs="Times New Roman"/>
+          <w:sz w:val="24"/>
+          <w:szCs w:val="24"/>
+        </w:rPr>
+        <w:t xml:space="preserve"> </w:t>
+      </w:r>
+      <w:r>
+        <w:rPr>
+          <w:rFonts w:ascii="Times New Roman" w:hAnsi="Times New Roman" w:cs="Times New Roman"/>
+          <w:sz w:val="24"/>
+          <w:szCs w:val="24"/>
+        </w:rPr>
+        <w:t xml:space="preserve">вычисление и отправка результата клиентом </w:t>
+      </w:r>
+      <w:r>
+        <w:rPr>
+          <w:rFonts w:ascii="Times New Roman" w:hAnsi="Times New Roman" w:cs="Times New Roman"/>
+          <w:sz w:val="24"/>
+          <w:szCs w:val="24"/>
+        </w:rPr>
+        <w:t>1</w:t>
+      </w:r>
+    </w:p>
+    <w:p>
+      <w:pPr>
+        <w:rPr>
+          <w:rFonts w:ascii="Times New Roman" w:hAnsi="Times New Roman" w:cs="Times New Roman"/>
+          <w:sz w:val="28"/>
+          <w:szCs w:val="28"/>
+        </w:rPr>
+      </w:pPr>
+      <w:r>
+        <w:rPr>
+          <w:rFonts w:ascii="Times New Roman" w:hAnsi="Times New Roman" w:cs="Times New Roman"/>
+          <w:sz w:val="28"/>
+          <w:szCs w:val="28"/>
+        </w:rPr>
+        <w:lastRenderedPageBreak/>
+        <w:drawing>
+          <wp:inline distT="0" distB="0" distL="0" distR="0" wp14:anchorId="4D1CC68E" wp14:editId="09CA2A4F">
+            <wp:extent cx="4791744" cy="685896"/>
+            <wp:effectExtent l="19050" t="19050" r="8890" b="19050"/>
+            <wp:docPr id="13" name="Рисунок 13"/>
+            <wp:cNvGraphicFramePr>
+              <a:graphicFrameLocks xmlns:a="http://schemas.openxmlformats.org/drawingml/2006/main" noChangeAspect="1"/>
+            </wp:cNvGraphicFramePr>
+            <a:graphic xmlns:a="http://schemas.openxmlformats.org/drawingml/2006/main">
+              <a:graphicData uri="http://schemas.openxmlformats.org/drawingml/2006/picture">
+                <pic:pic xmlns:pic="http://schemas.openxmlformats.org/drawingml/2006/picture">
+                  <pic:nvPicPr>
+                    <pic:cNvPr id="1" name=""/>
+                    <pic:cNvPicPr/>
+                  </pic:nvPicPr>
+                  <pic:blipFill>
+                    <a:blip r:embed="rId11"/>
+                    <a:stretch>
+                      <a:fillRect/>
+                    </a:stretch>
+                  </pic:blipFill>
+                  <pic:spPr>
+                    <a:xfrm>
+                      <a:off x="0" y="0"/>
+                      <a:ext cx="4791744" cy="685896"/>
+                    </a:xfrm>
+                    <a:prstGeom prst="rect">
+                      <a:avLst/>
+                    </a:prstGeom>
+                    <a:ln>
+                      <a:solidFill>
+                        <a:schemeClr val="tx1"/>
+                      </a:solidFill>
+                    </a:ln>
+                  </pic:spPr>
+                </pic:pic>
+              </a:graphicData>
+            </a:graphic>
+          </wp:inline>
+        </w:drawing>
+      </w:r>
+    </w:p>
+    <w:p>
+      <w:pPr>
+        <w:jc w:val="center"/>
+        <w:rPr>
+          <w:rFonts w:ascii="Times New Roman" w:hAnsi="Times New Roman" w:cs="Times New Roman"/>
+          <w:sz w:val="24"/>
+          <w:szCs w:val="24"/>
+        </w:rPr>
+      </w:pPr>
+      <w:r>
+        <w:rPr>
+          <w:rFonts w:ascii="Times New Roman" w:hAnsi="Times New Roman" w:cs="Times New Roman"/>
+          <w:sz w:val="24"/>
+          <w:szCs w:val="24"/>
+        </w:rPr>
+        <w:t xml:space="preserve">Рисунок </w:t>
+      </w:r>
+      <w:r>
+        <w:rPr>
+          <w:rFonts w:ascii="Times New Roman" w:hAnsi="Times New Roman" w:cs="Times New Roman"/>
+          <w:sz w:val="24"/>
+          <w:szCs w:val="24"/>
+        </w:rPr>
+        <w:t>7</w:t>
+      </w:r>
+      <w:r>
+        <w:rPr>
+          <w:rFonts w:ascii="Times New Roman" w:hAnsi="Times New Roman" w:cs="Times New Roman"/>
+          <w:sz w:val="24"/>
+          <w:szCs w:val="24"/>
+        </w:rPr>
+        <w:t xml:space="preserve"> -</w:t>
+      </w:r>
+      <w:r>
+        <w:rPr>
+          <w:rFonts w:ascii="Times New Roman" w:hAnsi="Times New Roman" w:cs="Times New Roman"/>
+          <w:sz w:val="24"/>
+          <w:szCs w:val="24"/>
+        </w:rPr>
+        <w:t xml:space="preserve"> </w:t>
+      </w:r>
+      <w:r>
+        <w:rPr>
+          <w:rFonts w:ascii="Times New Roman" w:hAnsi="Times New Roman" w:cs="Times New Roman"/>
+          <w:sz w:val="24"/>
+          <w:szCs w:val="24"/>
+        </w:rPr>
+        <w:t xml:space="preserve">вычисление и отправка результата клиентом </w:t>
+      </w:r>
+      <w:r>
+        <w:rPr>
+          <w:rFonts w:ascii="Times New Roman" w:hAnsi="Times New Roman" w:cs="Times New Roman"/>
+          <w:sz w:val="24"/>
+          <w:szCs w:val="24"/>
+        </w:rPr>
+        <w:t>2</w:t>
+      </w:r>
+    </w:p>
+    <w:p>
+      <w:pPr>
+        <w:rPr>
+          <w:rFonts w:ascii="Times New Roman" w:hAnsi="Times New Roman" w:cs="Times New Roman"/>
+          <w:sz w:val="28"/>
+          <w:szCs w:val="28"/>
+        </w:rPr>
+      </w:pPr>
+      <w:r>
+        <w:rPr>
+          <w:rFonts w:ascii="Times New Roman" w:hAnsi="Times New Roman" w:cs="Times New Roman"/>
+          <w:sz w:val="28"/>
+          <w:szCs w:val="28"/>
+        </w:rPr>
+        <w:drawing>
+          <wp:inline distT="0" distB="0" distL="0" distR="0" wp14:anchorId="26BDE085" wp14:editId="11AA9958">
+            <wp:extent cx="4763165" cy="676369"/>
+            <wp:effectExtent l="19050" t="19050" r="18415" b="28575"/>
+            <wp:docPr id="14" name="Рисунок 14"/>
+            <wp:cNvGraphicFramePr>
+              <a:graphicFrameLocks xmlns:a="http://schemas.openxmlformats.org/drawingml/2006/main" noChangeAspect="1"/>
+            </wp:cNvGraphicFramePr>
+            <a:graphic xmlns:a="http://schemas.openxmlformats.org/drawingml/2006/main">
+              <a:graphicData uri="http://schemas.openxmlformats.org/drawingml/2006/picture">
+                <pic:pic xmlns:pic="http://schemas.openxmlformats.org/drawingml/2006/picture">
+                  <pic:nvPicPr>
+                    <pic:cNvPr id="1" name=""/>
+                    <pic:cNvPicPr/>
+                  </pic:nvPicPr>
+                  <pic:blipFill>
+                    <a:blip r:embed="rId12"/>
+                    <a:stretch>
+                      <a:fillRect/>
+                    </a:stretch>
+                  </pic:blipFill>
+                  <pic:spPr>
+                    <a:xfrm>
+                      <a:off x="0" y="0"/>
+                      <a:ext cx="4763165" cy="676369"/>
+                    </a:xfrm>
+                    <a:prstGeom prst="rect">
+                      <a:avLst/>
+                    </a:prstGeom>
+                    <a:ln>
+                      <a:solidFill>
+                        <a:schemeClr val="tx1"/>
+                      </a:solidFill>
+                    </a:ln>
+                  </pic:spPr>
+                </pic:pic>
+              </a:graphicData>
+            </a:graphic>
+          </wp:inline>
+        </w:drawing>
+      </w:r>
+    </w:p>
+    <w:p>
+      <w:pPr>
+        <w:jc w:val="center"/>
+        <w:rPr>
+          <w:rFonts w:ascii="Times New Roman" w:hAnsi="Times New Roman" w:cs="Times New Roman"/>
+          <w:sz w:val="24"/>
+          <w:szCs w:val="24"/>
+        </w:rPr>
+      </w:pPr>
+      <w:r>
+        <w:rPr>
+          <w:rFonts w:ascii="Times New Roman" w:hAnsi="Times New Roman" w:cs="Times New Roman"/>
+          <w:sz w:val="24"/>
+          <w:szCs w:val="24"/>
+        </w:rPr>
+        <w:t xml:space="preserve">Рисунок </w:t>
+      </w:r>
+      <w:r>
+        <w:rPr>
+          <w:rFonts w:ascii="Times New Roman" w:hAnsi="Times New Roman" w:cs="Times New Roman"/>
+          <w:sz w:val="24"/>
+          <w:szCs w:val="24"/>
+        </w:rPr>
+        <w:t>8</w:t>
+      </w:r>
+      <w:r>
+        <w:rPr>
+          <w:rFonts w:ascii="Times New Roman" w:hAnsi="Times New Roman" w:cs="Times New Roman"/>
+          <w:sz w:val="24"/>
+          <w:szCs w:val="24"/>
+        </w:rPr>
+        <w:t xml:space="preserve"> -</w:t>
+      </w:r>
+      <w:r>
+        <w:rPr>
+          <w:rFonts w:ascii="Times New Roman" w:hAnsi="Times New Roman" w:cs="Times New Roman"/>
+          <w:sz w:val="24"/>
+          <w:szCs w:val="24"/>
+        </w:rPr>
+        <w:t xml:space="preserve"> </w:t>
+      </w:r>
+      <w:r>
+        <w:rPr>
+          <w:rFonts w:ascii="Times New Roman" w:hAnsi="Times New Roman" w:cs="Times New Roman"/>
+          <w:sz w:val="24"/>
+          <w:szCs w:val="24"/>
+        </w:rPr>
+        <w:t xml:space="preserve">вычисление и отправка результата клиентом </w:t>
+      </w:r>
+      <w:r>
+        <w:rPr>
+          <w:rFonts w:ascii="Times New Roman" w:hAnsi="Times New Roman" w:cs="Times New Roman"/>
+          <w:sz w:val="24"/>
+          <w:szCs w:val="24"/>
+        </w:rPr>
+        <w:t>3</w:t>
+      </w:r>
+    </w:p>
+    <w:p>
+      <w:pPr>
+        <w:rPr>
+          <w:rFonts w:ascii="Times New Roman" w:hAnsi="Times New Roman" w:cs="Times New Roman"/>
+          <w:sz w:val="28"/>
+          <w:szCs w:val="28"/>
+        </w:rPr>
+      </w:pPr>
+      <w:r>
+        <w:rPr>
+          <w:rFonts w:ascii="Times New Roman" w:hAnsi="Times New Roman" w:cs="Times New Roman"/>
+          <w:sz w:val="28"/>
+          <w:szCs w:val="28"/>
+        </w:rPr>
+        <w:drawing>
+          <wp:inline distT="0" distB="0" distL="0" distR="0" wp14:anchorId="7B9DEB8A" wp14:editId="63D4CF38">
+            <wp:extent cx="5915851" cy="581106"/>
+            <wp:effectExtent l="19050" t="19050" r="27940" b="28575"/>
+            <wp:docPr id="15" name="Рисунок 15"/>
+            <wp:cNvGraphicFramePr>
+              <a:graphicFrameLocks xmlns:a="http://schemas.openxmlformats.org/drawingml/2006/main" noChangeAspect="1"/>
+            </wp:cNvGraphicFramePr>
+            <a:graphic xmlns:a="http://schemas.openxmlformats.org/drawingml/2006/main">
+              <a:graphicData uri="http://schemas.openxmlformats.org/drawingml/2006/picture">
+                <pic:pic xmlns:pic="http://schemas.openxmlformats.org/drawingml/2006/picture">
+                  <pic:nvPicPr>
+                    <pic:cNvPr id="1" name=""/>
+                    <pic:cNvPicPr/>
+                  </pic:nvPicPr>
+                  <pic:blipFill>
+                    <a:blip r:embed="rId13"/>
+                    <a:stretch>
+                      <a:fillRect/>
+                    </a:stretch>
+                  </pic:blipFill>
+                  <pic:spPr>
+                    <a:xfrm>
+                      <a:off x="0" y="0"/>
+                      <a:ext cx="5915851" cy="581106"/>
+                    </a:xfrm>
+                    <a:prstGeom prst="rect">
+                      <a:avLst/>
+                    </a:prstGeom>
+                    <a:ln>
+                      <a:solidFill>
+                        <a:schemeClr val="tx1"/>
+                      </a:solidFill>
+                    </a:ln>
+                  </pic:spPr>
+                </pic:pic>
+              </a:graphicData>
+            </a:graphic>
+          </wp:inline>
+        </w:drawing>
+      </w:r>
+    </w:p>
+    <w:p>
+      <w:pPr>
+        <w:jc w:val="center"/>
+        <w:rPr>
+          <w:rFonts w:ascii="Times New Roman" w:hAnsi="Times New Roman" w:cs="Times New Roman"/>
+          <w:sz w:val="24"/>
+          <w:szCs w:val="24"/>
+        </w:rPr>
+      </w:pPr>
+      <w:r>
+        <w:rPr>
+          <w:rFonts w:ascii="Times New Roman" w:hAnsi="Times New Roman" w:cs="Times New Roman"/>
+          <w:sz w:val="24"/>
+          <w:szCs w:val="24"/>
+        </w:rPr>
+        <w:t xml:space="preserve">Рисунок </w:t>
+      </w:r>
+      <w:r>
+        <w:rPr>
+          <w:rFonts w:ascii="Times New Roman" w:hAnsi="Times New Roman" w:cs="Times New Roman"/>
+          <w:sz w:val="24"/>
+          <w:szCs w:val="24"/>
+        </w:rPr>
+        <w:t>9</w:t>
+      </w:r>
+      <w:r>
+        <w:rPr>
+          <w:rFonts w:ascii="Times New Roman" w:hAnsi="Times New Roman" w:cs="Times New Roman"/>
+          <w:sz w:val="24"/>
+          <w:szCs w:val="24"/>
+        </w:rPr>
+        <w:t xml:space="preserve"> -</w:t>
+      </w:r>
+      <w:r>
+        <w:rPr>
+          <w:rFonts w:ascii="Times New Roman" w:hAnsi="Times New Roman" w:cs="Times New Roman"/>
+          <w:sz w:val="24"/>
+          <w:szCs w:val="24"/>
+        </w:rPr>
+        <w:t xml:space="preserve"> </w:t>
+      </w:r>
+      <w:r>
+        <w:rPr>
+          <w:rFonts w:ascii="Times New Roman" w:hAnsi="Times New Roman" w:cs="Times New Roman"/>
+          <w:sz w:val="24"/>
+          <w:szCs w:val="24"/>
+        </w:rPr>
+        <w:t xml:space="preserve">вычисление и отправка результата клиентом </w:t>
+      </w:r>
+      <w:r>
+        <w:rPr>
+          <w:rFonts w:ascii="Times New Roman" w:hAnsi="Times New Roman" w:cs="Times New Roman"/>
+          <w:sz w:val="24"/>
+          <w:szCs w:val="24"/>
+        </w:rPr>
+        <w:t>4</w:t>
+      </w:r>
+    </w:p>
+    <w:p>
+      <w:pPr>
+        <w:rPr>
+          <w:rFonts w:ascii="Times New Roman" w:hAnsi="Times New Roman" w:cs="Times New Roman"/>
+          <w:sz w:val="28"/>
+          <w:szCs w:val="28"/>
+        </w:rPr>
+      </w:pPr>
+      <w:r>
+        <w:rPr>
+          <w:rFonts w:ascii="Times New Roman" w:hAnsi="Times New Roman" w:cs="Times New Roman"/>
+          <w:sz w:val="28"/>
+          <w:szCs w:val="28"/>
+        </w:rPr>
+        <w:drawing>
+          <wp:inline distT="0" distB="0" distL="0" distR="0" wp14:anchorId="209E2B41" wp14:editId="6F3F1048">
+            <wp:extent cx="5163271" cy="657317"/>
+            <wp:effectExtent l="19050" t="19050" r="18415" b="28575"/>
+            <wp:docPr id="16" name="Рисунок 16"/>
+            <wp:cNvGraphicFramePr>
+              <a:graphicFrameLocks xmlns:a="http://schemas.openxmlformats.org/drawingml/2006/main" noChangeAspect="1"/>
+            </wp:cNvGraphicFramePr>
+            <a:graphic xmlns:a="http://schemas.openxmlformats.org/drawingml/2006/main">
+              <a:graphicData uri="http://schemas.openxmlformats.org/drawingml/2006/picture">
+                <pic:pic xmlns:pic="http://schemas.openxmlformats.org/drawingml/2006/picture">
+                  <pic:nvPicPr>
+                    <pic:cNvPr id="1" name=""/>
+                    <pic:cNvPicPr/>
+                  </pic:nvPicPr>
+                  <pic:blipFill>
+                    <a:blip r:embed="rId14"/>
+                    <a:stretch>
+                      <a:fillRect/>
+                    </a:stretch>
+                  </pic:blipFill>
+                  <pic:spPr>
+                    <a:xfrm>
+                      <a:off x="0" y="0"/>
+                      <a:ext cx="5163271" cy="657317"/>
+                    </a:xfrm>
+                    <a:prstGeom prst="rect">
+                      <a:avLst/>
+                    </a:prstGeom>
+                    <a:ln>
+                      <a:solidFill>
+                        <a:schemeClr val="tx1"/>
+                      </a:solidFill>
+                    </a:ln>
+                  </pic:spPr>
+                </pic:pic>
+              </a:graphicData>
+            </a:graphic>
+          </wp:inline>
+        </w:drawing>
+      </w:r>
+    </w:p>
+    <w:p>
+      <w:pPr>
+        <w:jc w:val="center"/>
+        <w:rPr>
+          <w:rFonts w:ascii="Times New Roman" w:hAnsi="Times New Roman" w:cs="Times New Roman"/>
+          <w:sz w:val="24"/>
+          <w:szCs w:val="24"/>
+        </w:rPr>
+      </w:pPr>
+      <w:r>
+        <w:rPr>
+          <w:rFonts w:ascii="Times New Roman" w:hAnsi="Times New Roman" w:cs="Times New Roman"/>
+          <w:sz w:val="24"/>
+          <w:szCs w:val="24"/>
+        </w:rPr>
+        <w:t xml:space="preserve">Рисунок </w:t>
+      </w:r>
+      <w:r>
+        <w:rPr>
+          <w:rFonts w:ascii="Times New Roman" w:hAnsi="Times New Roman" w:cs="Times New Roman"/>
+          <w:sz w:val="24"/>
+          <w:szCs w:val="24"/>
+        </w:rPr>
+        <w:t>10</w:t>
+      </w:r>
+      <w:r>
+        <w:rPr>
+          <w:rFonts w:ascii="Times New Roman" w:hAnsi="Times New Roman" w:cs="Times New Roman"/>
+          <w:sz w:val="24"/>
+          <w:szCs w:val="24"/>
+        </w:rPr>
+        <w:t xml:space="preserve"> -</w:t>
+      </w:r>
+      <w:r>
+        <w:rPr>
+          <w:rFonts w:ascii="Times New Roman" w:hAnsi="Times New Roman" w:cs="Times New Roman"/>
+          <w:sz w:val="24"/>
+          <w:szCs w:val="24"/>
+        </w:rPr>
+        <w:t xml:space="preserve"> </w:t>
+      </w:r>
+      <w:r>
+        <w:rPr>
+          <w:rFonts w:ascii="Times New Roman" w:hAnsi="Times New Roman" w:cs="Times New Roman"/>
+          <w:sz w:val="24"/>
+          <w:szCs w:val="24"/>
+        </w:rPr>
+        <w:t xml:space="preserve">вычисление и отправка результата клиентом </w:t>
+      </w:r>
+      <w:r>
+        <w:rPr>
+          <w:rFonts w:ascii="Times New Roman" w:hAnsi="Times New Roman" w:cs="Times New Roman"/>
+          <w:sz w:val="24"/>
+          <w:szCs w:val="24"/>
+        </w:rPr>
+        <w:t>5</w:t>
+      </w:r>
+    </w:p>
+    <w:p>
+      <w:pPr>
+        <w:rPr>
+          <w:rFonts w:ascii="Times New Roman" w:hAnsi="Times New Roman" w:cs="Times New Roman"/>
+          <w:sz w:val="28"/>
+          <w:szCs w:val="28"/>
+        </w:rPr>
+      </w:pPr>
+      <w:r>
+        <w:rPr>
+          <w:rFonts w:ascii="Times New Roman" w:hAnsi="Times New Roman" w:cs="Times New Roman"/>
+          <w:sz w:val="28"/>
+          <w:szCs w:val="28"/>
+        </w:rPr>
+        <w:drawing>
+          <wp:inline distT="0" distB="0" distL="0" distR="0" wp14:anchorId="2CB1BCDB" wp14:editId="5FF383D9">
+            <wp:extent cx="4658375" cy="371527"/>
+            <wp:effectExtent l="19050" t="19050" r="8890" b="28575"/>
+            <wp:docPr id="17" name="Рисунок 17"/>
+            <wp:cNvGraphicFramePr>
+              <a:graphicFrameLocks xmlns:a="http://schemas.openxmlformats.org/drawingml/2006/main" noChangeAspect="1"/>
+            </wp:cNvGraphicFramePr>
+            <a:graphic xmlns:a="http://schemas.openxmlformats.org/drawingml/2006/main">
+              <a:graphicData uri="http://schemas.openxmlformats.org/drawingml/2006/picture">
+                <pic:pic xmlns:pic="http://schemas.openxmlformats.org/drawingml/2006/picture">
+                  <pic:nvPicPr>
+                    <pic:cNvPr id="1" name=""/>
+                    <pic:cNvPicPr/>
+                  </pic:nvPicPr>
+                  <pic:blipFill>
+                    <a:blip r:embed="rId15"/>
+                    <a:stretch>
+                      <a:fillRect/>
+                    </a:stretch>
+                  </pic:blipFill>
+                  <pic:spPr>
+                    <a:xfrm>
+                      <a:off x="0" y="0"/>
+                      <a:ext cx="4658375" cy="371527"/>
+                    </a:xfrm>
+                    <a:prstGeom prst="rect">
+                      <a:avLst/>
+                    </a:prstGeom>
+                    <a:ln>
+                      <a:solidFill>
+                        <a:schemeClr val="tx1"/>
+                      </a:solidFill>
+                    </a:ln>
+                  </pic:spPr>
+                </pic:pic>
+              </a:graphicData>
+            </a:graphic>
+          </wp:inline>
+        </w:drawing>
+      </w:r>
+    </w:p>
+    <w:p>
+      <w:pPr>
+        <w:jc w:val="center"/>
+        <w:rPr>
+          <w:rFonts w:ascii="Times New Roman" w:hAnsi="Times New Roman" w:cs="Times New Roman"/>
+          <w:sz w:val="24"/>
+          <w:szCs w:val="24"/>
+        </w:rPr>
+      </w:pPr>
+      <w:r>
+        <w:rPr>
+          <w:rFonts w:ascii="Times New Roman" w:hAnsi="Times New Roman" w:cs="Times New Roman"/>
+          <w:sz w:val="24"/>
+          <w:szCs w:val="24"/>
+        </w:rPr>
+        <w:t>Рисунок 1</w:t>
+      </w:r>
+      <w:r>
+        <w:rPr>
+          <w:rFonts w:ascii="Times New Roman" w:hAnsi="Times New Roman" w:cs="Times New Roman"/>
+          <w:sz w:val="24"/>
+          <w:szCs w:val="24"/>
+        </w:rPr>
+        <w:t>1</w:t>
+      </w:r>
+      <w:r>
+        <w:rPr>
+          <w:rFonts w:ascii="Times New Roman" w:hAnsi="Times New Roman" w:cs="Times New Roman"/>
+          <w:sz w:val="24"/>
+          <w:szCs w:val="24"/>
+        </w:rPr>
+        <w:t xml:space="preserve"> </w:t>
+      </w:r>
+      <w:r>
+        <w:rPr>
+          <w:rFonts w:ascii="Times New Roman" w:hAnsi="Times New Roman" w:cs="Times New Roman"/>
+          <w:sz w:val="24"/>
+          <w:szCs w:val="24"/>
+        </w:rPr>
+        <w:t>– Получение готового результата</w:t>
+      </w:r>
+    </w:p>
+    <w:p>
+      <w:pPr>
+        <w:ind w:firstLine="709"/>
+        <w:rPr>
+          <w:rFonts w:ascii="Times New Roman" w:hAnsi="Times New Roman" w:cs="Times New Roman"/>
+          <w:sz w:val="28"/>
+          <w:szCs w:val="28"/>
+        </w:rPr>
+      </w:pPr>
+      <w:r>
+        <w:rPr>
+          <w:rFonts w:ascii="Times New Roman" w:hAnsi="Times New Roman" w:cs="Times New Roman"/>
+          <w:sz w:val="28"/>
+          <w:szCs w:val="28"/>
+        </w:rPr>
+        <w:t>Проверяем результат в онлайн калькуляторе</w:t>
+      </w:r>
+    </w:p>
+    <w:p>
+      <w:pPr>
+        <w:jc w:val="center"/>
+        <w:rPr>
+          <w:rFonts w:ascii="Times New Roman" w:hAnsi="Times New Roman" w:cs="Times New Roman"/>
+          <w:sz w:val="28"/>
+          <w:szCs w:val="28"/>
+        </w:rPr>
+      </w:pPr>
+      <w:r>
+        <w:rPr>
+          <w:rFonts w:ascii="Times New Roman" w:hAnsi="Times New Roman" w:cs="Times New Roman"/>
+          <w:sz w:val="28"/>
+          <w:szCs w:val="28"/>
+        </w:rPr>
+        <w:drawing>
+          <wp:inline distT="0" distB="0" distL="0" distR="0" wp14:anchorId="4136D15C" wp14:editId="059D5160">
+            <wp:extent cx="2972215" cy="2419688"/>
+            <wp:effectExtent l="0" t="0" r="0" b="0"/>
+            <wp:docPr id="18" name="Рисунок 18"/>
+            <wp:cNvGraphicFramePr>
+              <a:graphicFrameLocks xmlns:a="http://schemas.openxmlformats.org/drawingml/2006/main" noChangeAspect="1"/>
+            </wp:cNvGraphicFramePr>
+            <a:graphic xmlns:a="http://schemas.openxmlformats.org/drawingml/2006/main">
+              <a:graphicData uri="http://schemas.openxmlformats.org/drawingml/2006/picture">
+                <pic:pic xmlns:pic="http://schemas.openxmlformats.org/drawingml/2006/picture">
+                  <pic:nvPicPr>
+                    <pic:cNvPr id="1" name=""/>
+                    <pic:cNvPicPr/>
+                  </pic:nvPicPr>
+                  <pic:blipFill>
+                    <a:blip r:embed="rId16"/>
+                    <a:stretch>
+                      <a:fillRect/>
+                    </a:stretch>
+                  </pic:blipFill>
+                  <pic:spPr>
+                    <a:xfrm>
+                      <a:off x="0" y="0"/>
+                      <a:ext cx="2972215" cy="2419688"/>
                     </a:xfrm>
                     <a:prstGeom prst="rect">
                       <a:avLst/>
@@ -982,6 +1924,48 @@
             </a:graphic>
           </wp:inline>
         </w:drawing>
+      </w:r>
+    </w:p>
+    <w:p>
+      <w:pPr>
+        <w:jc w:val="center"/>
+        <w:rPr>
+          <w:rFonts w:ascii="Times New Roman" w:hAnsi="Times New Roman" w:cs="Times New Roman"/>
+          <w:sz w:val="24"/>
+          <w:szCs w:val="24"/>
+        </w:rPr>
+      </w:pPr>
+      <w:r>
+        <w:rPr>
+          <w:rFonts w:ascii="Times New Roman" w:hAnsi="Times New Roman" w:cs="Times New Roman"/>
+          <w:sz w:val="24"/>
+          <w:szCs w:val="24"/>
+        </w:rPr>
+        <w:t>Рисунок 1</w:t>
+      </w:r>
+      <w:r>
+        <w:rPr>
+          <w:rFonts w:ascii="Times New Roman" w:hAnsi="Times New Roman" w:cs="Times New Roman"/>
+          <w:sz w:val="24"/>
+          <w:szCs w:val="24"/>
+        </w:rPr>
+        <w:t>2</w:t>
+      </w:r>
+      <w:r>
+        <w:rPr>
+          <w:rFonts w:ascii="Times New Roman" w:hAnsi="Times New Roman" w:cs="Times New Roman"/>
+          <w:sz w:val="24"/>
+          <w:szCs w:val="24"/>
+        </w:rPr>
+        <w:t xml:space="preserve"> -</w:t>
+      </w:r>
+      <w:r>
+        <w:rPr>
+          <w:rFonts w:ascii="Times New Roman" w:hAnsi="Times New Roman" w:cs="Times New Roman"/>
+          <w:sz w:val="24"/>
+          <w:szCs w:val="24"/>
+        </w:rPr>
+        <w:t xml:space="preserve"> Проверка</w:t>
       </w:r>
     </w:p>
     <w:p>

</xml_diff>